<commit_message>
got the site plan looking good.
</commit_message>
<xml_diff>
--- a/final/Site name.docx
+++ b/final/Site name.docx
@@ -14,7 +14,14 @@
           <w:b/>
           <w:bCs/>
         </w:rPr>
-        <w:t>[Site name] Site Plan</w:t>
+        <w:t xml:space="preserve">Character Creator </w:t>
+      </w:r>
+      <w:r>
+        <w:rPr>
+          <w:b/>
+          <w:bCs/>
+        </w:rPr>
+        <w:t>Site Plan</w:t>
       </w:r>
     </w:p>
     <w:p>
@@ -133,13 +140,14 @@
     </w:p>
     <w:p>
       <w:r>
-        <w:t xml:space="preserve">JavaScript will be used to create and manage dynamic content on the site. Users will be able to input character information and store it using </w:t>
-      </w:r>
-      <w:proofErr w:type="spellStart"/>
-      <w:r>
-        <w:t>localStorage</w:t>
-      </w:r>
-      <w:proofErr w:type="spellEnd"/>
+        <w:t>JavaScript will be used to create and manage dynamic content throughout the site</w:t>
+      </w:r>
+      <w:r>
+        <w:t xml:space="preserve">. Users will be able to input character information and store it using </w:t>
+      </w:r>
+      <w:r>
+        <w:t>local Storage</w:t>
+      </w:r>
       <w:r>
         <w:t>, allowing data to persist between pages. The site will dynamically display saved characters and allow users to search or filter them. Additionally, JavaScript will update the page in real time when characters are added or selected.</w:t>
       </w:r>
@@ -240,7 +248,7 @@
           </mc:Choice>
           <mc:Fallback>
             <w:pict>
-              <v:rect w14:anchorId="75F0DF9A" id="Rectangle 6" o:spid="_x0000_s1026" alt="Logo image" style="width:24pt;height:24pt;visibility:visible;mso-wrap-style:square;mso-left-percent:-10001;mso-top-percent:-10001;mso-position-horizontal:absolute;mso-position-horizontal-relative:char;mso-position-vertical:absolute;mso-position-vertical-relative:line;mso-left-percent:-10001;mso-top-percent:-10001;v-text-anchor:top" o:gfxdata="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" filled="f" stroked="f">
+              <v:rect w14:anchorId="30753F0E" id="Rectangle 6" o:spid="_x0000_s1026" alt="Logo image" style="width:24pt;height:24pt;visibility:visible;mso-wrap-style:square;mso-left-percent:-10001;mso-top-percent:-10001;mso-position-horizontal:absolute;mso-position-horizontal-relative:char;mso-position-vertical:absolute;mso-position-vertical-relative:line;mso-left-percent:-10001;mso-top-percent:-10001;v-text-anchor:top" o:gfxdata="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" filled="f" stroked="f">
                 <o:lock v:ext="edit" aspectratio="t"/>
                 <w10:anchorlock/>
               </v:rect>
@@ -549,327 +557,7 @@
     </w:p>
     <w:p>
       <w:r>
-        <w:t xml:space="preserve">Lorem ipsum dolor </w:t>
-      </w:r>
-      <w:proofErr w:type="gramStart"/>
-      <w:r>
-        <w:t>sit</w:t>
-      </w:r>
-      <w:proofErr w:type="gramEnd"/>
-      <w:r>
-        <w:t xml:space="preserve"> </w:t>
-      </w:r>
-      <w:proofErr w:type="spellStart"/>
-      <w:r>
-        <w:t>amet</w:t>
-      </w:r>
-      <w:proofErr w:type="spellEnd"/>
-      <w:r>
-        <w:t xml:space="preserve">, </w:t>
-      </w:r>
-      <w:proofErr w:type="spellStart"/>
-      <w:r>
-        <w:t>consectetur</w:t>
-      </w:r>
-      <w:proofErr w:type="spellEnd"/>
-      <w:r>
-        <w:t xml:space="preserve"> </w:t>
-      </w:r>
-      <w:proofErr w:type="spellStart"/>
-      <w:r>
-        <w:t>adipiscing</w:t>
-      </w:r>
-      <w:proofErr w:type="spellEnd"/>
-      <w:r>
-        <w:t xml:space="preserve"> </w:t>
-      </w:r>
-      <w:proofErr w:type="spellStart"/>
-      <w:r>
-        <w:t>elit</w:t>
-      </w:r>
-      <w:proofErr w:type="spellEnd"/>
-      <w:r>
-        <w:t xml:space="preserve">, sed do </w:t>
-      </w:r>
-      <w:proofErr w:type="spellStart"/>
-      <w:r>
-        <w:t>eiusmod</w:t>
-      </w:r>
-      <w:proofErr w:type="spellEnd"/>
-      <w:r>
-        <w:t xml:space="preserve"> </w:t>
-      </w:r>
-      <w:proofErr w:type="spellStart"/>
-      <w:r>
-        <w:t>tempor</w:t>
-      </w:r>
-      <w:proofErr w:type="spellEnd"/>
-      <w:r>
-        <w:t xml:space="preserve"> </w:t>
-      </w:r>
-      <w:proofErr w:type="spellStart"/>
-      <w:r>
-        <w:t>incididunt</w:t>
-      </w:r>
-      <w:proofErr w:type="spellEnd"/>
-      <w:r>
-        <w:t xml:space="preserve"> </w:t>
-      </w:r>
-      <w:proofErr w:type="spellStart"/>
-      <w:r>
-        <w:t>ut</w:t>
-      </w:r>
-      <w:proofErr w:type="spellEnd"/>
-      <w:r>
-        <w:t xml:space="preserve"> labore et dolore magna </w:t>
-      </w:r>
-      <w:proofErr w:type="spellStart"/>
-      <w:r>
-        <w:t>aliqua</w:t>
-      </w:r>
-      <w:proofErr w:type="spellEnd"/>
-      <w:r>
-        <w:t xml:space="preserve">. Ut </w:t>
-      </w:r>
-      <w:proofErr w:type="spellStart"/>
-      <w:r>
-        <w:t>enim</w:t>
-      </w:r>
-      <w:proofErr w:type="spellEnd"/>
-      <w:r>
-        <w:t xml:space="preserve"> ad minim </w:t>
-      </w:r>
-      <w:proofErr w:type="spellStart"/>
-      <w:r>
-        <w:t>veniam</w:t>
-      </w:r>
-      <w:proofErr w:type="spellEnd"/>
-      <w:r>
-        <w:t xml:space="preserve">, quis </w:t>
-      </w:r>
-      <w:proofErr w:type="spellStart"/>
-      <w:r>
-        <w:t>nostrud</w:t>
-      </w:r>
-      <w:proofErr w:type="spellEnd"/>
-      <w:r>
-        <w:t xml:space="preserve"> exercitation </w:t>
-      </w:r>
-      <w:proofErr w:type="spellStart"/>
-      <w:r>
-        <w:t>ullamco</w:t>
-      </w:r>
-      <w:proofErr w:type="spellEnd"/>
-      <w:r>
-        <w:t xml:space="preserve"> </w:t>
-      </w:r>
-      <w:proofErr w:type="spellStart"/>
-      <w:r>
-        <w:t>laboris</w:t>
-      </w:r>
-      <w:proofErr w:type="spellEnd"/>
-      <w:r>
-        <w:t xml:space="preserve"> nisi </w:t>
-      </w:r>
-      <w:proofErr w:type="spellStart"/>
-      <w:r>
-        <w:t>ut</w:t>
-      </w:r>
-      <w:proofErr w:type="spellEnd"/>
-      <w:r>
-        <w:t xml:space="preserve"> </w:t>
-      </w:r>
-      <w:proofErr w:type="spellStart"/>
-      <w:r>
-        <w:t>aliquip</w:t>
-      </w:r>
-      <w:proofErr w:type="spellEnd"/>
-      <w:r>
-        <w:t xml:space="preserve"> ex </w:t>
-      </w:r>
-      <w:proofErr w:type="spellStart"/>
-      <w:r>
-        <w:t>ea</w:t>
-      </w:r>
-      <w:proofErr w:type="spellEnd"/>
-      <w:r>
-        <w:t xml:space="preserve"> </w:t>
-      </w:r>
-      <w:proofErr w:type="spellStart"/>
-      <w:r>
-        <w:t>commodo</w:t>
-      </w:r>
-      <w:proofErr w:type="spellEnd"/>
-      <w:r>
-        <w:t xml:space="preserve"> </w:t>
-      </w:r>
-      <w:proofErr w:type="spellStart"/>
-      <w:r>
-        <w:t>consequat</w:t>
-      </w:r>
-      <w:proofErr w:type="spellEnd"/>
-      <w:r>
-        <w:t xml:space="preserve">. Duis </w:t>
-      </w:r>
-      <w:proofErr w:type="spellStart"/>
-      <w:r>
-        <w:t>aute</w:t>
-      </w:r>
-      <w:proofErr w:type="spellEnd"/>
-      <w:r>
-        <w:t xml:space="preserve"> </w:t>
-      </w:r>
-      <w:proofErr w:type="spellStart"/>
-      <w:r>
-        <w:t>irure</w:t>
-      </w:r>
-      <w:proofErr w:type="spellEnd"/>
-      <w:r>
-        <w:t xml:space="preserve"> dolor in </w:t>
-      </w:r>
-      <w:proofErr w:type="spellStart"/>
-      <w:r>
-        <w:t>reprehenderit</w:t>
-      </w:r>
-      <w:proofErr w:type="spellEnd"/>
-      <w:r>
-        <w:t xml:space="preserve"> in </w:t>
-      </w:r>
-      <w:proofErr w:type="spellStart"/>
-      <w:r>
-        <w:t>voluptate</w:t>
-      </w:r>
-      <w:proofErr w:type="spellEnd"/>
-      <w:r>
-        <w:t xml:space="preserve"> </w:t>
-      </w:r>
-      <w:proofErr w:type="spellStart"/>
-      <w:r>
-        <w:t>velit</w:t>
-      </w:r>
-      <w:proofErr w:type="spellEnd"/>
-      <w:r>
-        <w:t xml:space="preserve"> esse </w:t>
-      </w:r>
-      <w:proofErr w:type="spellStart"/>
-      <w:r>
-        <w:t>cillum</w:t>
-      </w:r>
-      <w:proofErr w:type="spellEnd"/>
-      <w:r>
-        <w:t xml:space="preserve"> dolore </w:t>
-      </w:r>
-      <w:proofErr w:type="spellStart"/>
-      <w:r>
-        <w:t>eu</w:t>
-      </w:r>
-      <w:proofErr w:type="spellEnd"/>
-      <w:r>
-        <w:t xml:space="preserve"> </w:t>
-      </w:r>
-      <w:proofErr w:type="spellStart"/>
-      <w:r>
-        <w:t>fugiat</w:t>
-      </w:r>
-      <w:proofErr w:type="spellEnd"/>
-      <w:r>
-        <w:t xml:space="preserve"> </w:t>
-      </w:r>
-      <w:proofErr w:type="spellStart"/>
-      <w:r>
-        <w:t>nulla</w:t>
-      </w:r>
-      <w:proofErr w:type="spellEnd"/>
-      <w:r>
-        <w:t xml:space="preserve"> </w:t>
-      </w:r>
-      <w:proofErr w:type="spellStart"/>
-      <w:r>
-        <w:t>pariatur</w:t>
-      </w:r>
-      <w:proofErr w:type="spellEnd"/>
-      <w:r>
-        <w:t xml:space="preserve">. </w:t>
-      </w:r>
-      <w:proofErr w:type="spellStart"/>
-      <w:r>
-        <w:t>Excepteur</w:t>
-      </w:r>
-      <w:proofErr w:type="spellEnd"/>
-      <w:r>
-        <w:t xml:space="preserve"> </w:t>
-      </w:r>
-      <w:proofErr w:type="spellStart"/>
-      <w:r>
-        <w:t>sint</w:t>
-      </w:r>
-      <w:proofErr w:type="spellEnd"/>
-      <w:r>
-        <w:t xml:space="preserve"> </w:t>
-      </w:r>
-      <w:proofErr w:type="spellStart"/>
-      <w:r>
-        <w:t>occaecat</w:t>
-      </w:r>
-      <w:proofErr w:type="spellEnd"/>
-      <w:r>
-        <w:t xml:space="preserve"> </w:t>
-      </w:r>
-      <w:proofErr w:type="spellStart"/>
-      <w:r>
-        <w:t>cupidatat</w:t>
-      </w:r>
-      <w:proofErr w:type="spellEnd"/>
-      <w:r>
-        <w:t xml:space="preserve"> non </w:t>
-      </w:r>
-      <w:proofErr w:type="spellStart"/>
-      <w:r>
-        <w:t>proident</w:t>
-      </w:r>
-      <w:proofErr w:type="spellEnd"/>
-      <w:r>
-        <w:t xml:space="preserve">, sunt in culpa qui </w:t>
-      </w:r>
-      <w:proofErr w:type="spellStart"/>
-      <w:r>
-        <w:t>officia</w:t>
-      </w:r>
-      <w:proofErr w:type="spellEnd"/>
-      <w:r>
-        <w:t xml:space="preserve"> </w:t>
-      </w:r>
-      <w:proofErr w:type="spellStart"/>
-      <w:r>
-        <w:t>deserunt</w:t>
-      </w:r>
-      <w:proofErr w:type="spellEnd"/>
-      <w:r>
-        <w:t xml:space="preserve"> </w:t>
-      </w:r>
-      <w:proofErr w:type="spellStart"/>
-      <w:r>
-        <w:t>mollit</w:t>
-      </w:r>
-      <w:proofErr w:type="spellEnd"/>
-      <w:r>
-        <w:t xml:space="preserve"> </w:t>
-      </w:r>
-      <w:proofErr w:type="spellStart"/>
-      <w:r>
-        <w:t>anim</w:t>
-      </w:r>
-      <w:proofErr w:type="spellEnd"/>
-      <w:r>
-        <w:t xml:space="preserve"> id est </w:t>
-      </w:r>
-      <w:proofErr w:type="spellStart"/>
-      <w:r>
-        <w:t>laborum</w:t>
-      </w:r>
-      <w:proofErr w:type="spellEnd"/>
-      <w:r>
-        <w:t>.</w:t>
+        <w:t>This website provides an interactive way to create and manage unique characters. Users can quickly input details or generate ideas, making it a useful tool for storytelling, gaming, or creative projects.</w:t>
       </w:r>
     </w:p>
     <w:p>
@@ -889,167 +577,7 @@
     </w:p>
     <w:p>
       <w:r>
-        <w:t xml:space="preserve">Lorem ipsum dolor </w:t>
-      </w:r>
-      <w:proofErr w:type="gramStart"/>
-      <w:r>
-        <w:t>sit</w:t>
-      </w:r>
-      <w:proofErr w:type="gramEnd"/>
-      <w:r>
-        <w:t xml:space="preserve"> </w:t>
-      </w:r>
-      <w:proofErr w:type="spellStart"/>
-      <w:r>
-        <w:t>amet</w:t>
-      </w:r>
-      <w:proofErr w:type="spellEnd"/>
-      <w:r>
-        <w:t xml:space="preserve">, </w:t>
-      </w:r>
-      <w:proofErr w:type="spellStart"/>
-      <w:r>
-        <w:t>consectetur</w:t>
-      </w:r>
-      <w:proofErr w:type="spellEnd"/>
-      <w:r>
-        <w:t xml:space="preserve"> </w:t>
-      </w:r>
-      <w:proofErr w:type="spellStart"/>
-      <w:r>
-        <w:t>adipiscing</w:t>
-      </w:r>
-      <w:proofErr w:type="spellEnd"/>
-      <w:r>
-        <w:t xml:space="preserve"> </w:t>
-      </w:r>
-      <w:proofErr w:type="spellStart"/>
-      <w:r>
-        <w:t>elit</w:t>
-      </w:r>
-      <w:proofErr w:type="spellEnd"/>
-      <w:r>
-        <w:t xml:space="preserve">, sed do </w:t>
-      </w:r>
-      <w:proofErr w:type="spellStart"/>
-      <w:r>
-        <w:t>eiusmod</w:t>
-      </w:r>
-      <w:proofErr w:type="spellEnd"/>
-      <w:r>
-        <w:t xml:space="preserve"> </w:t>
-      </w:r>
-      <w:proofErr w:type="spellStart"/>
-      <w:r>
-        <w:t>tempor</w:t>
-      </w:r>
-      <w:proofErr w:type="spellEnd"/>
-      <w:r>
-        <w:t xml:space="preserve"> </w:t>
-      </w:r>
-      <w:proofErr w:type="spellStart"/>
-      <w:r>
-        <w:t>incididunt</w:t>
-      </w:r>
-      <w:proofErr w:type="spellEnd"/>
-      <w:r>
-        <w:t xml:space="preserve"> </w:t>
-      </w:r>
-      <w:proofErr w:type="spellStart"/>
-      <w:r>
-        <w:t>ut</w:t>
-      </w:r>
-      <w:proofErr w:type="spellEnd"/>
-      <w:r>
-        <w:t xml:space="preserve"> labore et dolore magna </w:t>
-      </w:r>
-      <w:proofErr w:type="spellStart"/>
-      <w:r>
-        <w:t>aliqua</w:t>
-      </w:r>
-      <w:proofErr w:type="spellEnd"/>
-      <w:r>
-        <w:t xml:space="preserve">. Ut </w:t>
-      </w:r>
-      <w:proofErr w:type="spellStart"/>
-      <w:r>
-        <w:t>enim</w:t>
-      </w:r>
-      <w:proofErr w:type="spellEnd"/>
-      <w:r>
-        <w:t xml:space="preserve"> ad minim </w:t>
-      </w:r>
-      <w:proofErr w:type="spellStart"/>
-      <w:r>
-        <w:t>veniam</w:t>
-      </w:r>
-      <w:proofErr w:type="spellEnd"/>
-      <w:r>
-        <w:t xml:space="preserve">, quis </w:t>
-      </w:r>
-      <w:proofErr w:type="spellStart"/>
-      <w:r>
-        <w:t>nostrud</w:t>
-      </w:r>
-      <w:proofErr w:type="spellEnd"/>
-      <w:r>
-        <w:t xml:space="preserve"> exercitation </w:t>
-      </w:r>
-      <w:proofErr w:type="spellStart"/>
-      <w:r>
-        <w:t>ullamco</w:t>
-      </w:r>
-      <w:proofErr w:type="spellEnd"/>
-      <w:r>
-        <w:t xml:space="preserve"> </w:t>
-      </w:r>
-      <w:proofErr w:type="spellStart"/>
-      <w:r>
-        <w:t>laboris</w:t>
-      </w:r>
-      <w:proofErr w:type="spellEnd"/>
-      <w:r>
-        <w:t xml:space="preserve"> nisi </w:t>
-      </w:r>
-      <w:proofErr w:type="spellStart"/>
-      <w:r>
-        <w:t>ut</w:t>
-      </w:r>
-      <w:proofErr w:type="spellEnd"/>
-      <w:r>
-        <w:t xml:space="preserve"> </w:t>
-      </w:r>
-      <w:proofErr w:type="spellStart"/>
-      <w:r>
-        <w:t>aliquip</w:t>
-      </w:r>
-      <w:proofErr w:type="spellEnd"/>
-      <w:r>
-        <w:t xml:space="preserve"> ex </w:t>
-      </w:r>
-      <w:proofErr w:type="spellStart"/>
-      <w:r>
-        <w:t>ea</w:t>
-      </w:r>
-      <w:proofErr w:type="spellEnd"/>
-      <w:r>
-        <w:t xml:space="preserve"> </w:t>
-      </w:r>
-      <w:proofErr w:type="spellStart"/>
-      <w:r>
-        <w:t>commodo</w:t>
-      </w:r>
-      <w:proofErr w:type="spellEnd"/>
-      <w:r>
-        <w:t xml:space="preserve"> </w:t>
-      </w:r>
-      <w:proofErr w:type="spellStart"/>
-      <w:r>
-        <w:t>consequat</w:t>
-      </w:r>
-      <w:proofErr w:type="spellEnd"/>
-      <w:r>
-        <w:t>.</w:t>
+        <w:t>The character library allows users to search and explore saved characters easily. With dynamic updates and filtering options, users can quickly find and review character details in an organized way.</w:t>
       </w:r>
     </w:p>
     <w:p>
@@ -1077,27 +605,13 @@
         </w:r>
       </w:hyperlink>
       <w:r>
+        <w:t xml:space="preserve"> |</w:t>
+      </w:r>
+      <w:r>
         <w:t> </w:t>
       </w:r>
-      <w:proofErr w:type="spellStart"/>
-      <w:r>
-        <w:fldChar w:fldCharType="begin"/>
-      </w:r>
-      <w:r>
-        <w:instrText>HYPERLINK "https://wddbyui.github.io/wdd131/prove/prove_wk11_template.html"</w:instrText>
-      </w:r>
-      <w:r>
-        <w:fldChar w:fldCharType="separate"/>
-      </w:r>
-      <w:r>
-        <w:rPr>
-          <w:rStyle w:val="Hyperlink"/>
-        </w:rPr>
-        <w:t>Browse_Characters</w:t>
-      </w:r>
-      <w:proofErr w:type="spellEnd"/>
-      <w:r>
-        <w:fldChar w:fldCharType="end"/>
+      <w:r>
+        <w:t>Character Library</w:t>
       </w:r>
     </w:p>
     <w:p>
@@ -1296,17 +810,35 @@
     </w:p>
     <w:p>
       <w:pPr>
-        <w:rPr>
-          <w:b/>
-          <w:bCs/>
-        </w:rPr>
-      </w:pPr>
-      <w:r>
-        <w:rPr>
-          <w:b/>
-          <w:bCs/>
-        </w:rPr>
-        <w:lastRenderedPageBreak/>
+        <w:numPr>
+          <w:ilvl w:val="0"/>
+          <w:numId w:val="2"/>
+        </w:numPr>
+        <w:rPr>
+          <w:b/>
+          <w:bCs/>
+        </w:rPr>
+      </w:pPr>
+      <w:r>
+        <w:rPr>
+          <w:b/>
+          <w:bCs/>
+        </w:rPr>
+        <w:t>About/Backstory</w:t>
+      </w:r>
+    </w:p>
+    <w:p>
+      <w:pPr>
+        <w:rPr>
+          <w:b/>
+          <w:bCs/>
+        </w:rPr>
+      </w:pPr>
+      <w:r>
+        <w:rPr>
+          <w:b/>
+          <w:bCs/>
+        </w:rPr>
         <w:t>Buttons:</w:t>
       </w:r>
     </w:p>
@@ -1326,6 +858,7 @@
           <w:b/>
           <w:bCs/>
         </w:rPr>
+        <w:lastRenderedPageBreak/>
         <w:t>“Add Character</w:t>
       </w:r>
       <w:r>
@@ -1384,6 +917,14 @@
           <w:bCs/>
         </w:rPr>
       </w:pPr>
+    </w:p>
+    <w:p>
+      <w:pPr>
+        <w:rPr>
+          <w:b/>
+          <w:bCs/>
+        </w:rPr>
+      </w:pPr>
       <w:r>
         <w:rPr>
           <w:b/>
@@ -1628,6 +1169,25 @@
     </w:p>
     <w:p>
       <w:pPr>
+        <w:numPr>
+          <w:ilvl w:val="1"/>
+          <w:numId w:val="7"/>
+        </w:numPr>
+        <w:rPr>
+          <w:b/>
+          <w:bCs/>
+        </w:rPr>
+      </w:pPr>
+      <w:r>
+        <w:rPr>
+          <w:b/>
+          <w:bCs/>
+        </w:rPr>
+        <w:t>About/Backstory</w:t>
+      </w:r>
+    </w:p>
+    <w:p>
+      <w:pPr>
         <w:rPr>
           <w:b/>
           <w:bCs/>
@@ -1663,10 +1223,66 @@
     </w:p>
     <w:p>
       <w:r>
-        <w:t>[Any additional details about home that the wireframe does not make clear]</w:t>
-      </w:r>
-    </w:p>
-    <w:p>
+        <w:t>[Navigation]</w:t>
+      </w:r>
+      <w:r>
+        <w:br/>
+      </w:r>
+      <w:r>
+        <w:br/>
+        <w:t>[Title: Character Creator]</w:t>
+      </w:r>
+      <w:r>
+        <w:br/>
+      </w:r>
+      <w:r>
+        <w:br/>
+        <w:t>[Name Input]</w:t>
+      </w:r>
+      <w:r>
+        <w:br/>
+        <w:t>[Role Input]</w:t>
+      </w:r>
+      <w:r>
+        <w:br/>
+        <w:t>[Trait Input]</w:t>
+      </w:r>
+      <w:r>
+        <w:br/>
+      </w:r>
+      <w:r>
+        <w:lastRenderedPageBreak/>
+        <w:t>[Weakness Input]</w:t>
+      </w:r>
+      <w:r>
+        <w:br/>
+      </w:r>
+      <w:r>
+        <w:t>[About</w:t>
+      </w:r>
+      <w:r>
+        <w:t>/Backstory</w:t>
+      </w:r>
+      <w:r>
+        <w:t xml:space="preserve"> input]</w:t>
+      </w:r>
+    </w:p>
+    <w:p>
+      <w:r>
+        <w:br/>
+        <w:t>[Add Character Button]</w:t>
+      </w:r>
+      <w:r>
+        <w:br/>
+        <w:t>[Generate Button (optional)]</w:t>
+      </w:r>
+      <w:r>
+        <w:br/>
+      </w:r>
+      <w:r>
+        <w:br/>
+        <w:t>[Confirmation Message]</w:t>
+      </w:r>
       <w:r>
         <mc:AlternateContent>
           <mc:Choice Requires="wps">
@@ -1727,7 +1343,7 @@
           </mc:Choice>
           <mc:Fallback>
             <w:pict>
-              <v:rect w14:anchorId="7F7F2E50" id="Rectangle 5" o:spid="_x0000_s1026" alt="home page wireframe" style="width:24pt;height:24pt;visibility:visible;mso-wrap-style:square;mso-left-percent:-10001;mso-top-percent:-10001;mso-position-horizontal:absolute;mso-position-horizontal-relative:char;mso-position-vertical:absolute;mso-position-vertical-relative:line;mso-left-percent:-10001;mso-top-percent:-10001;v-text-anchor:top" o:gfxdata="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" filled="f" stroked="f">
+              <v:rect w14:anchorId="4BA62470" id="Rectangle 5" o:spid="_x0000_s1026" alt="home page wireframe" style="width:24pt;height:24pt;visibility:visible;mso-wrap-style:square;mso-left-percent:-10001;mso-top-percent:-10001;mso-position-horizontal:absolute;mso-position-horizontal-relative:char;mso-position-vertical:absolute;mso-position-vertical-relative:line;mso-left-percent:-10001;mso-top-percent:-10001;v-text-anchor:top" o:gfxdata="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" filled="f" stroked="f">
                 <o:lock v:ext="edit" aspectratio="t"/>
                 <w10:anchorlock/>
               </v:rect>
@@ -1753,10 +1369,58 @@
     </w:p>
     <w:p>
       <w:r>
-        <w:t>[Any additional details about page 2 that the wireframe does not make clear]</w:t>
-      </w:r>
-    </w:p>
-    <w:p>
+        <w:t>[Navigation]</w:t>
+      </w:r>
+      <w:r>
+        <w:br/>
+      </w:r>
+      <w:r>
+        <w:br/>
+        <w:t>[Title: Character Library]</w:t>
+      </w:r>
+      <w:r>
+        <w:br/>
+      </w:r>
+      <w:r>
+        <w:br/>
+        <w:t>[Search Bar]</w:t>
+      </w:r>
+      <w:r>
+        <w:br/>
+      </w:r>
+      <w:r>
+        <w:br/>
+        <w:t>[Character List]</w:t>
+      </w:r>
+      <w:r>
+        <w:br/>
+        <w:t>- Zara Vex</w:t>
+      </w:r>
+      <w:r>
+        <w:br/>
+        <w:t>- Eli Rowan</w:t>
+      </w:r>
+      <w:r>
+        <w:br/>
+        <w:t>- etc.</w:t>
+      </w:r>
+      <w:r>
+        <w:br/>
+      </w:r>
+      <w:r>
+        <w:br/>
+        <w:t>[Selected Character Details]</w:t>
+      </w:r>
+      <w:r>
+        <w:br/>
+        <w:t>(Name, Role, Trait, Weakness</w:t>
+      </w:r>
+      <w:r>
+        <w:t>, about</w:t>
+      </w:r>
+      <w:r>
+        <w:t>)</w:t>
+      </w:r>
       <w:r>
         <mc:AlternateContent>
           <mc:Choice Requires="wps">
@@ -1817,7 +1481,7 @@
           </mc:Choice>
           <mc:Fallback>
             <w:pict>
-              <v:rect w14:anchorId="3BD4C86A" id="Rectangle 4" o:spid="_x0000_s1026" alt="page 2 wireframe" style="width:24pt;height:24pt;visibility:visible;mso-wrap-style:square;mso-left-percent:-10001;mso-top-percent:-10001;mso-position-horizontal:absolute;mso-position-horizontal-relative:char;mso-position-vertical:absolute;mso-position-vertical-relative:line;mso-left-percent:-10001;mso-top-percent:-10001;v-text-anchor:top" o:gfxdata="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" filled="f" stroked="f">
+              <v:rect w14:anchorId="4075B717" id="Rectangle 4" o:spid="_x0000_s1026" alt="page 2 wireframe" style="width:24pt;height:24pt;visibility:visible;mso-wrap-style:square;mso-left-percent:-10001;mso-top-percent:-10001;mso-position-horizontal:absolute;mso-position-horizontal-relative:char;mso-position-vertical:absolute;mso-position-vertical-relative:line;mso-left-percent:-10001;mso-top-percent:-10001;v-text-anchor:top" o:gfxdata="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" filled="f" stroked="f">
                 <o:lock v:ext="edit" aspectratio="t"/>
                 <w10:anchorlock/>
               </v:rect>

</xml_diff>